<commit_message>
Dashboard analytics OK + setup live tab (work in progress)
</commit_message>
<xml_diff>
--- a/lancez 0.docx
+++ b/lancez 0.docx
@@ -389,11 +389,19 @@
       </w:pPr>
     </w:p>
     <w:p>
-      <w:r>
-        <w:rPr>
-          <w:highlight w:val="yellow"/>
-        </w:rPr>
-        <w:t>docker compose down -v</w:t>
+      <w:proofErr w:type="gramStart"/>
+      <w:r>
+        <w:rPr>
+          <w:highlight w:val="yellow"/>
+        </w:rPr>
+        <w:t>docker</w:t>
+      </w:r>
+      <w:proofErr w:type="gramEnd"/>
+      <w:r>
+        <w:rPr>
+          <w:highlight w:val="yellow"/>
+        </w:rPr>
+        <w:t xml:space="preserve"> compose down -v</w:t>
       </w:r>
     </w:p>
     <w:p>
@@ -462,6 +470,7 @@
         </w:rPr>
       </w:pPr>
       <w:proofErr w:type="spellStart"/>
+      <w:proofErr w:type="gramStart"/>
       <w:r>
         <w:rPr>
           <w:highlight w:val="yellow"/>
@@ -469,6 +478,7 @@
         <w:t>rmdir</w:t>
       </w:r>
       <w:proofErr w:type="spellEnd"/>
+      <w:proofErr w:type="gramEnd"/>
       <w:r>
         <w:rPr>
           <w:highlight w:val="yellow"/>
@@ -483,6 +493,7 @@
         </w:rPr>
       </w:pPr>
       <w:proofErr w:type="spellStart"/>
+      <w:proofErr w:type="gramStart"/>
       <w:r>
         <w:rPr>
           <w:highlight w:val="yellow"/>
@@ -490,6 +501,7 @@
         <w:t>mkdir</w:t>
       </w:r>
       <w:proofErr w:type="spellEnd"/>
+      <w:proofErr w:type="gramEnd"/>
       <w:r>
         <w:rPr>
           <w:highlight w:val="yellow"/>
@@ -499,6 +511,7 @@
     </w:p>
     <w:p>
       <w:proofErr w:type="spellStart"/>
+      <w:proofErr w:type="gramStart"/>
       <w:r>
         <w:rPr>
           <w:highlight w:val="yellow"/>
@@ -506,6 +519,7 @@
         <w:t>mkdir</w:t>
       </w:r>
       <w:proofErr w:type="spellEnd"/>
+      <w:proofErr w:type="gramEnd"/>
       <w:r>
         <w:rPr>
           <w:highlight w:val="yellow"/>
@@ -547,11 +561,19 @@
       </w:r>
     </w:p>
     <w:p>
-      <w:r>
-        <w:rPr>
-          <w:highlight w:val="yellow"/>
-        </w:rPr>
-        <w:t>docker compose up -d</w:t>
+      <w:proofErr w:type="gramStart"/>
+      <w:r>
+        <w:rPr>
+          <w:highlight w:val="yellow"/>
+        </w:rPr>
+        <w:t>docker</w:t>
+      </w:r>
+      <w:proofErr w:type="gramEnd"/>
+      <w:r>
+        <w:rPr>
+          <w:highlight w:val="yellow"/>
+        </w:rPr>
+        <w:t xml:space="preserve"> compose up -d</w:t>
       </w:r>
     </w:p>
     <w:p>
@@ -586,7 +608,39 @@
           <w:highlight w:val="yellow"/>
           <w:lang w:val="en-US"/>
         </w:rPr>
-        <w:t xml:space="preserve"> --format "table {{.Names}}\t{{.Status}}"</w:t>
+        <w:t xml:space="preserve"> --format "table {</w:t>
+      </w:r>
+      <w:proofErr w:type="gramStart"/>
+      <w:r>
+        <w:rPr>
+          <w:highlight w:val="yellow"/>
+          <w:lang w:val="en-US"/>
+        </w:rPr>
+        <w:t>{.Names}}\</w:t>
+      </w:r>
+      <w:proofErr w:type="gramEnd"/>
+      <w:r>
+        <w:rPr>
+          <w:highlight w:val="yellow"/>
+          <w:lang w:val="en-US"/>
+        </w:rPr>
+        <w:t>t{</w:t>
+      </w:r>
+      <w:proofErr w:type="gramStart"/>
+      <w:r>
+        <w:rPr>
+          <w:highlight w:val="yellow"/>
+          <w:lang w:val="en-US"/>
+        </w:rPr>
+        <w:t>{.Status</w:t>
+      </w:r>
+      <w:proofErr w:type="gramEnd"/>
+      <w:r>
+        <w:rPr>
+          <w:highlight w:val="yellow"/>
+          <w:lang w:val="en-US"/>
+        </w:rPr>
+        <w:t>}}"</w:t>
       </w:r>
     </w:p>
     <w:p>
@@ -853,7 +907,39 @@
           <w:highlight w:val="yellow"/>
           <w:lang w:val="en-US"/>
         </w:rPr>
-        <w:t xml:space="preserve">  --packages org.apache.spark:spark-sql-kafka-0-10_2.12:3.5.3 ^</w:t>
+        <w:t xml:space="preserve">  --packages </w:t>
+      </w:r>
+      <w:proofErr w:type="gramStart"/>
+      <w:r>
+        <w:rPr>
+          <w:highlight w:val="yellow"/>
+          <w:lang w:val="en-US"/>
+        </w:rPr>
+        <w:t>org.apache</w:t>
+      </w:r>
+      <w:proofErr w:type="gramEnd"/>
+      <w:r>
+        <w:rPr>
+          <w:highlight w:val="yellow"/>
+          <w:lang w:val="en-US"/>
+        </w:rPr>
+        <w:t>.</w:t>
+      </w:r>
+      <w:proofErr w:type="gramStart"/>
+      <w:r>
+        <w:rPr>
+          <w:highlight w:val="yellow"/>
+          <w:lang w:val="en-US"/>
+        </w:rPr>
+        <w:t>spark:spark</w:t>
+      </w:r>
+      <w:proofErr w:type="gramEnd"/>
+      <w:r>
+        <w:rPr>
+          <w:highlight w:val="yellow"/>
+          <w:lang w:val="en-US"/>
+        </w:rPr>
+        <w:t>-sql-kafka-0-10_2.12:3.5.3 ^</w:t>
       </w:r>
     </w:p>
     <w:p>
@@ -979,16 +1065,26 @@
       </w:r>
     </w:p>
     <w:p>
-      <w:r>
-        <w:t xml:space="preserve">python -c "import pandas as </w:t>
-      </w:r>
-      <w:proofErr w:type="spellStart"/>
+      <w:proofErr w:type="gramStart"/>
+      <w:r>
+        <w:t>python</w:t>
+      </w:r>
+      <w:proofErr w:type="gramEnd"/>
+      <w:r>
+        <w:t xml:space="preserve"> -c "import pandas as </w:t>
+      </w:r>
+      <w:proofErr w:type="spellStart"/>
+      <w:proofErr w:type="gramStart"/>
       <w:r>
         <w:t>pd</w:t>
       </w:r>
       <w:proofErr w:type="spellEnd"/>
       <w:r>
-        <w:t xml:space="preserve">; </w:t>
+        <w:t>;</w:t>
+      </w:r>
+      <w:proofErr w:type="gramEnd"/>
+      <w:r>
+        <w:t xml:space="preserve"> </w:t>
       </w:r>
       <w:proofErr w:type="spellStart"/>
       <w:r>
@@ -999,12 +1095,25 @@
         <w:t>=</w:t>
       </w:r>
       <w:proofErr w:type="spellStart"/>
-      <w:r>
-        <w:t>pd.read_parquet</w:t>
-      </w:r>
-      <w:proofErr w:type="spellEnd"/>
-      <w:r>
-        <w:t xml:space="preserve">('data/parquet_events_v2'); </w:t>
+      <w:proofErr w:type="gramStart"/>
+      <w:r>
+        <w:t>pd.read</w:t>
+      </w:r>
+      <w:proofErr w:type="gramEnd"/>
+      <w:r>
+        <w:t>_parquet</w:t>
+      </w:r>
+      <w:proofErr w:type="spellEnd"/>
+      <w:r>
+        <w:t>('data/parquet_events_v2'</w:t>
+      </w:r>
+      <w:proofErr w:type="gramStart"/>
+      <w:r>
+        <w:t>);</w:t>
+      </w:r>
+      <w:proofErr w:type="gramEnd"/>
+      <w:r>
+        <w:t xml:space="preserve"> </w:t>
       </w:r>
       <w:proofErr w:type="spellStart"/>
       <w:r>
@@ -1020,13 +1129,18 @@
       </w:r>
       <w:proofErr w:type="spellEnd"/>
       <w:r>
-        <w:t>=',</w:t>
+        <w:t>=</w:t>
+      </w:r>
+      <w:proofErr w:type="gramStart"/>
+      <w:r>
+        <w:t>',</w:t>
       </w:r>
       <w:proofErr w:type="spellStart"/>
       <w:r>
         <w:t>len</w:t>
       </w:r>
       <w:proofErr w:type="spellEnd"/>
+      <w:proofErr w:type="gramEnd"/>
       <w:r>
         <w:t>(</w:t>
       </w:r>
@@ -1036,7 +1150,23 @@
       </w:r>
       <w:proofErr w:type="spellEnd"/>
       <w:r>
-        <w:t>)); print(df[['event_ts','producer_ts','e2e_latency_ms','emotion']].tail(10))"</w:t>
+        <w:t>)</w:t>
+      </w:r>
+      <w:proofErr w:type="gramStart"/>
+      <w:r>
+        <w:t>);</w:t>
+      </w:r>
+      <w:proofErr w:type="gramEnd"/>
+      <w:r>
+        <w:t xml:space="preserve"> print(df[['event_ts','producer_ts','e2e_latency_ms','emotion']</w:t>
+      </w:r>
+      <w:proofErr w:type="gramStart"/>
+      <w:r>
+        <w:t>].tail</w:t>
+      </w:r>
+      <w:proofErr w:type="gramEnd"/>
+      <w:r>
+        <w:t>(10))"</w:t>
       </w:r>
     </w:p>
     <w:p>
@@ -1206,8 +1336,18 @@
           <w:bCs/>
           <w:lang w:val="en-US"/>
         </w:rPr>
-        <w:t>Windows (CMD) :</w:t>
-      </w:r>
+        <w:t>Windows (CMD</w:t>
+      </w:r>
+      <w:proofErr w:type="gramStart"/>
+      <w:r>
+        <w:rPr>
+          <w:b/>
+          <w:bCs/>
+          <w:lang w:val="en-US"/>
+        </w:rPr>
+        <w:t>) :</w:t>
+      </w:r>
+      <w:proofErr w:type="gramEnd"/>
     </w:p>
     <w:p>
       <w:pPr>
@@ -1305,8 +1445,18 @@
           <w:bCs/>
           <w:lang w:val="en-US"/>
         </w:rPr>
-        <w:t>Container (Spark master) :</w:t>
-      </w:r>
+        <w:t>Container (Spark master</w:t>
+      </w:r>
+      <w:proofErr w:type="gramStart"/>
+      <w:r>
+        <w:rPr>
+          <w:b/>
+          <w:bCs/>
+          <w:lang w:val="en-US"/>
+        </w:rPr>
+        <w:t>) :</w:t>
+      </w:r>
+      <w:proofErr w:type="gramEnd"/>
     </w:p>
     <w:p>
       <w:pPr>
@@ -1498,7 +1648,7 @@
     <w:p>
       <w:r>
         <w:pict w14:anchorId="1017C558">
-          <v:rect id="_x0000_i1062" style="width:0;height:1.5pt" o:hralign="center" o:hrstd="t" o:hr="t" fillcolor="#a0a0a0" stroked="f"/>
+          <v:rect id="_x0000_i1032" style="width:0;height:1.5pt" o:hralign="center" o:hrstd="t" o:hr="t" fillcolor="#a0a0a0" stroked="f"/>
         </w:pict>
       </w:r>
     </w:p>
@@ -1592,7 +1742,35 @@
         <w:rPr>
           <w:lang w:val="en-US"/>
         </w:rPr>
-        <w:t>/ivy --master spark://spark-master:7077 --packages org.apache.spark:spark-sql-kafka-0-10_2.12:3.5.3 /opt/spark/work-</w:t>
+        <w:t xml:space="preserve">/ivy --master spark://spark-master:7077 --packages </w:t>
+      </w:r>
+      <w:proofErr w:type="gramStart"/>
+      <w:r>
+        <w:rPr>
+          <w:lang w:val="en-US"/>
+        </w:rPr>
+        <w:t>org.apache</w:t>
+      </w:r>
+      <w:proofErr w:type="gramEnd"/>
+      <w:r>
+        <w:rPr>
+          <w:lang w:val="en-US"/>
+        </w:rPr>
+        <w:t>.</w:t>
+      </w:r>
+      <w:proofErr w:type="gramStart"/>
+      <w:r>
+        <w:rPr>
+          <w:lang w:val="en-US"/>
+        </w:rPr>
+        <w:t>spark:spark</w:t>
+      </w:r>
+      <w:proofErr w:type="gramEnd"/>
+      <w:r>
+        <w:rPr>
+          <w:lang w:val="en-US"/>
+        </w:rPr>
+        <w:t>-sql-kafka-0-10_2.12:3.5.3 /opt/spark/work-</w:t>
       </w:r>
       <w:proofErr w:type="spellStart"/>
       <w:r>
@@ -1638,7 +1816,7 @@
     <w:p>
       <w:r>
         <w:pict w14:anchorId="7AFA786A">
-          <v:rect id="_x0000_i1063" style="width:0;height:1.5pt" o:hralign="center" o:hrstd="t" o:hr="t" fillcolor="#a0a0a0" stroked="f"/>
+          <v:rect id="_x0000_i1033" style="width:0;height:1.5pt" o:hralign="center" o:hrstd="t" o:hr="t" fillcolor="#a0a0a0" stroked="f"/>
         </w:pict>
       </w:r>
     </w:p>
@@ -1686,7 +1864,7 @@
     <w:p>
       <w:r>
         <w:pict w14:anchorId="75EA643B">
-          <v:rect id="_x0000_i1064" style="width:0;height:1.5pt" o:hralign="center" o:hrstd="t" o:hr="t" fillcolor="#a0a0a0" stroked="f"/>
+          <v:rect id="_x0000_i1034" style="width:0;height:1.5pt" o:hralign="center" o:hrstd="t" o:hr="t" fillcolor="#a0a0a0" stroked="f"/>
         </w:pict>
       </w:r>
     </w:p>
@@ -1712,10 +1890,12 @@
     </w:p>
     <w:p>
       <w:proofErr w:type="spellStart"/>
+      <w:proofErr w:type="gramStart"/>
       <w:r>
         <w:t>dir</w:t>
       </w:r>
       <w:proofErr w:type="spellEnd"/>
+      <w:proofErr w:type="gramEnd"/>
       <w:r>
         <w:t xml:space="preserve"> data\parquet_events_v2</w:t>
       </w:r>
@@ -1924,7 +2104,7 @@
     <w:p>
       <w:r>
         <w:pict w14:anchorId="3C1410AA">
-          <v:rect id="_x0000_i1065" style="width:0;height:1.5pt" o:hralign="center" o:hrstd="t" o:hr="t" fillcolor="#a0a0a0" stroked="f"/>
+          <v:rect id="_x0000_i1035" style="width:0;height:1.5pt" o:hralign="center" o:hrstd="t" o:hr="t" fillcolor="#a0a0a0" stroked="f"/>
         </w:pict>
       </w:r>
     </w:p>
@@ -2087,8 +2267,368 @@
     <w:p>
       <w:r>
         <w:pict w14:anchorId="68D00C84">
-          <v:rect id="_x0000_i1066" style="width:0;height:1.5pt" o:hralign="center" o:hrstd="t" o:hr="t" fillcolor="#a0a0a0" stroked="f"/>
+          <v:rect id="_x0000_i1036" style="width:0;height:1.5pt" o:hralign="center" o:hrstd="t" o:hr="t" fillcolor="#a0a0a0" stroked="f"/>
         </w:pict>
+      </w:r>
+    </w:p>
+    <w:p>
+      <w:pPr>
+        <w:rPr>
+          <w:lang w:val="en-US"/>
+        </w:rPr>
+      </w:pPr>
+    </w:p>
+    <w:p>
+      <w:pPr>
+        <w:rPr>
+          <w:b/>
+          <w:bCs/>
+        </w:rPr>
+      </w:pPr>
+      <w:r>
+        <w:rPr>
+          <w:rFonts w:ascii="Segoe UI Emoji" w:hAnsi="Segoe UI Emoji" w:cs="Segoe UI Emoji"/>
+          <w:b/>
+          <w:bCs/>
+        </w:rPr>
+        <w:t>✅</w:t>
+      </w:r>
+      <w:r>
+        <w:rPr>
+          <w:b/>
+          <w:bCs/>
+        </w:rPr>
+        <w:t xml:space="preserve"> La meilleure commande pour une timeline “jolie” (pour la démo)</w:t>
+      </w:r>
+    </w:p>
+    <w:p>
+      <w:pPr>
+        <w:rPr>
+          <w:b/>
+          <w:bCs/>
+        </w:rPr>
+      </w:pPr>
+      <w:r>
+        <w:rPr>
+          <w:b/>
+          <w:bCs/>
+        </w:rPr>
+        <w:t>Option A (recommandée) — 1 message / seconde pendant 2 minutes</w:t>
+      </w:r>
+    </w:p>
+    <w:p>
+      <w:r>
+        <w:t>Ça va te donner une courbe claire.</w:t>
+      </w:r>
+    </w:p>
+    <w:p>
+      <w:pPr>
+        <w:rPr>
+          <w:lang w:val="en-US"/>
+        </w:rPr>
+      </w:pPr>
+      <w:r>
+        <w:rPr>
+          <w:lang w:val="en-US"/>
+        </w:rPr>
+        <w:t xml:space="preserve">python send_kafka_30.py --topic </w:t>
+      </w:r>
+      <w:proofErr w:type="spellStart"/>
+      <w:r>
+        <w:rPr>
+          <w:lang w:val="en-US"/>
+        </w:rPr>
+        <w:t>test_topic</w:t>
+      </w:r>
+      <w:proofErr w:type="spellEnd"/>
+      <w:r>
+        <w:rPr>
+          <w:lang w:val="en-US"/>
+        </w:rPr>
+        <w:t xml:space="preserve"> --container final_project-kafka-1 --n 120 --sleep-</w:t>
+      </w:r>
+      <w:proofErr w:type="spellStart"/>
+      <w:r>
+        <w:rPr>
+          <w:lang w:val="en-US"/>
+        </w:rPr>
+        <w:t>ms</w:t>
+      </w:r>
+      <w:proofErr w:type="spellEnd"/>
+      <w:r>
+        <w:rPr>
+          <w:lang w:val="en-US"/>
+        </w:rPr>
+        <w:t xml:space="preserve"> 1000 --start-frame-id 5000 --source-id cam_01</w:t>
+      </w:r>
+    </w:p>
+    <w:p>
+      <w:pPr>
+        <w:rPr>
+          <w:b/>
+          <w:bCs/>
+        </w:rPr>
+      </w:pPr>
+      <w:r>
+        <w:rPr>
+          <w:b/>
+          <w:bCs/>
+        </w:rPr>
+        <w:t>Option B — 5 msg / seconde pendant 1 minute</w:t>
+      </w:r>
+    </w:p>
+    <w:p>
+      <w:pPr>
+        <w:rPr>
+          <w:lang w:val="en-US"/>
+        </w:rPr>
+      </w:pPr>
+      <w:r>
+        <w:rPr>
+          <w:lang w:val="en-US"/>
+        </w:rPr>
+        <w:lastRenderedPageBreak/>
+        <w:t xml:space="preserve">python send_kafka_30.py --topic </w:t>
+      </w:r>
+      <w:proofErr w:type="spellStart"/>
+      <w:r>
+        <w:rPr>
+          <w:lang w:val="en-US"/>
+        </w:rPr>
+        <w:t>test_topic</w:t>
+      </w:r>
+      <w:proofErr w:type="spellEnd"/>
+      <w:r>
+        <w:rPr>
+          <w:lang w:val="en-US"/>
+        </w:rPr>
+        <w:t xml:space="preserve"> --container final_project-kafka-1 --n 300 --sleep-</w:t>
+      </w:r>
+      <w:proofErr w:type="spellStart"/>
+      <w:r>
+        <w:rPr>
+          <w:lang w:val="en-US"/>
+        </w:rPr>
+        <w:t>ms</w:t>
+      </w:r>
+      <w:proofErr w:type="spellEnd"/>
+      <w:r>
+        <w:rPr>
+          <w:lang w:val="en-US"/>
+        </w:rPr>
+        <w:t xml:space="preserve"> 200 --start-frame-id 6000 --source-id cam_01</w:t>
+      </w:r>
+    </w:p>
+    <w:p>
+      <w:pPr>
+        <w:rPr>
+          <w:b/>
+          <w:bCs/>
+        </w:rPr>
+      </w:pPr>
+      <w:r>
+        <w:rPr>
+          <w:b/>
+          <w:bCs/>
+        </w:rPr>
+        <w:t>Option C — plusieurs caméras (pour montrer le filtre “Source”)</w:t>
+      </w:r>
+    </w:p>
+    <w:p>
+      <w:r>
+        <w:t xml:space="preserve">Ouvre </w:t>
+      </w:r>
+      <w:r>
+        <w:rPr>
+          <w:b/>
+          <w:bCs/>
+        </w:rPr>
+        <w:t>2 terminaux</w:t>
+      </w:r>
+      <w:r>
+        <w:t xml:space="preserve"> et lance en même temps :</w:t>
+      </w:r>
+    </w:p>
+    <w:p>
+      <w:pPr>
+        <w:rPr>
+          <w:lang w:val="en-US"/>
+        </w:rPr>
+      </w:pPr>
+      <w:r>
+        <w:rPr>
+          <w:b/>
+          <w:bCs/>
+          <w:lang w:val="en-US"/>
+        </w:rPr>
+        <w:t>Terminal 1</w:t>
+      </w:r>
+    </w:p>
+    <w:p>
+      <w:pPr>
+        <w:rPr>
+          <w:lang w:val="en-US"/>
+        </w:rPr>
+      </w:pPr>
+      <w:r>
+        <w:rPr>
+          <w:lang w:val="en-US"/>
+        </w:rPr>
+        <w:t xml:space="preserve">python send_kafka_30.py --topic </w:t>
+      </w:r>
+      <w:proofErr w:type="spellStart"/>
+      <w:r>
+        <w:rPr>
+          <w:lang w:val="en-US"/>
+        </w:rPr>
+        <w:t>test_topic</w:t>
+      </w:r>
+      <w:proofErr w:type="spellEnd"/>
+      <w:r>
+        <w:rPr>
+          <w:lang w:val="en-US"/>
+        </w:rPr>
+        <w:t xml:space="preserve"> --container final_project-kafka-1 --n 120 --sleep-</w:t>
+      </w:r>
+      <w:proofErr w:type="spellStart"/>
+      <w:r>
+        <w:rPr>
+          <w:lang w:val="en-US"/>
+        </w:rPr>
+        <w:t>ms</w:t>
+      </w:r>
+      <w:proofErr w:type="spellEnd"/>
+      <w:r>
+        <w:rPr>
+          <w:lang w:val="en-US"/>
+        </w:rPr>
+        <w:t xml:space="preserve"> 1000 --start-frame-id 7000 --source-id cam_01</w:t>
+      </w:r>
+    </w:p>
+    <w:p>
+      <w:pPr>
+        <w:rPr>
+          <w:lang w:val="en-US"/>
+        </w:rPr>
+      </w:pPr>
+      <w:r>
+        <w:rPr>
+          <w:b/>
+          <w:bCs/>
+          <w:lang w:val="en-US"/>
+        </w:rPr>
+        <w:t>Terminal 2</w:t>
+      </w:r>
+    </w:p>
+    <w:p>
+      <w:pPr>
+        <w:rPr>
+          <w:lang w:val="en-US"/>
+        </w:rPr>
+      </w:pPr>
+      <w:r>
+        <w:rPr>
+          <w:lang w:val="en-US"/>
+        </w:rPr>
+        <w:t xml:space="preserve">python send_kafka_30.py --topic </w:t>
+      </w:r>
+      <w:proofErr w:type="spellStart"/>
+      <w:r>
+        <w:rPr>
+          <w:lang w:val="en-US"/>
+        </w:rPr>
+        <w:t>test_topic</w:t>
+      </w:r>
+      <w:proofErr w:type="spellEnd"/>
+      <w:r>
+        <w:rPr>
+          <w:lang w:val="en-US"/>
+        </w:rPr>
+        <w:t xml:space="preserve"> --container final_project-kafka-1 --n 120 --sleep-</w:t>
+      </w:r>
+      <w:proofErr w:type="spellStart"/>
+      <w:r>
+        <w:rPr>
+          <w:lang w:val="en-US"/>
+        </w:rPr>
+        <w:t>ms</w:t>
+      </w:r>
+      <w:proofErr w:type="spellEnd"/>
+      <w:r>
+        <w:rPr>
+          <w:lang w:val="en-US"/>
+        </w:rPr>
+        <w:t xml:space="preserve"> 1000 --start-frame-id 8000 --source-id cam_02</w:t>
+      </w:r>
+    </w:p>
+    <w:p>
+      <w:r>
+        <w:pict w14:anchorId="549DB4E3">
+          <v:rect id="_x0000_i1043" style="width:0;height:1.5pt" o:hralign="center" o:hrstd="t" o:hr="t" fillcolor="#a0a0a0" stroked="f"/>
+        </w:pict>
+      </w:r>
+    </w:p>
+    <w:p/>
+    <w:p/>
+    <w:p>
+      <w:pPr>
+        <w:rPr>
+          <w:b/>
+          <w:bCs/>
+        </w:rPr>
+      </w:pPr>
+      <w:r>
+        <w:rPr>
+          <w:b/>
+          <w:bCs/>
+        </w:rPr>
+        <w:t>Relance proprement (commande exacte)</w:t>
+      </w:r>
+    </w:p>
+    <w:p>
+      <w:r>
+        <w:t>Dans la racine du projet :</w:t>
+      </w:r>
+    </w:p>
+    <w:p>
+      <w:pPr>
+        <w:rPr>
+          <w:lang w:val="en-US"/>
+        </w:rPr>
+      </w:pPr>
+      <w:proofErr w:type="spellStart"/>
+      <w:r>
+        <w:rPr>
+          <w:lang w:val="en-US"/>
+        </w:rPr>
+        <w:t>streamlit</w:t>
+      </w:r>
+      <w:proofErr w:type="spellEnd"/>
+      <w:r>
+        <w:rPr>
+          <w:lang w:val="en-US"/>
+        </w:rPr>
+        <w:t xml:space="preserve"> cache clear</w:t>
+      </w:r>
+      <w:r>
+        <w:rPr>
+          <w:lang w:val="en-US"/>
+        </w:rPr>
+        <w:br/>
+      </w:r>
+      <w:proofErr w:type="spellStart"/>
+      <w:r>
+        <w:rPr>
+          <w:lang w:val="en-US"/>
+        </w:rPr>
+        <w:t>streamlit</w:t>
+      </w:r>
+      <w:proofErr w:type="spellEnd"/>
+      <w:r>
+        <w:rPr>
+          <w:lang w:val="en-US"/>
+        </w:rPr>
+        <w:t xml:space="preserve"> run src/dashboard/app.py</w:t>
       </w:r>
     </w:p>
     <w:p>

</xml_diff>